<commit_message>
"Day #617 - Working on Datacamp Project"
</commit_message>
<xml_diff>
--- a/datacamp/projects/10_ANALYZING_STUDENTS_MENTAL_HEALTH/ANALYZING_STUDENTS_MENTAL_HEALTH.docx
+++ b/datacamp/projects/10_ANALYZING_STUDENTS_MENTAL_HEALTH/ANALYZING_STUDENTS_MENTAL_HEALTH.docx
@@ -105,7 +105,17 @@
           <w:kern w:val="0"/>
           <w14:ligatures w14:val="none"/>
         </w:rPr>
-        <w:t> data to see how the length of stay (</w:t>
+        <w:t xml:space="preserve"> data to </w:t>
+      </w:r>
+      <w:r>
+        <w:rPr>
+          <w:rFonts w:ascii="Arial" w:eastAsia="Times New Roman" w:hAnsi="Arial" w:cs="Arial"/>
+          <w:color w:val="05192D"/>
+          <w:kern w:val="0"/>
+          <w:highlight w:val="yellow"/>
+          <w14:ligatures w14:val="none"/>
+        </w:rPr>
+        <w:t>see how the length of stay (</w:t>
       </w:r>
       <w:r>
         <w:rPr>
@@ -114,6 +124,7 @@
           <w:kern w:val="0"/>
           <w:sz w:val="20"/>
           <w:szCs w:val="20"/>
+          <w:highlight w:val="yellow"/>
           <w:shd w:val="clear" w:color="auto" w:fill="E8E8EE"/>
           <w14:ligatures w14:val="none"/>
         </w:rPr>
@@ -124,6 +135,7 @@
           <w:rFonts w:ascii="Arial" w:eastAsia="Times New Roman" w:hAnsi="Arial" w:cs="Arial"/>
           <w:color w:val="05192D"/>
           <w:kern w:val="0"/>
+          <w:highlight w:val="yellow"/>
           <w14:ligatures w14:val="none"/>
         </w:rPr>
         <w:t>) impacts the average mental health diagnostic scores of the </w:t>
@@ -135,6 +147,7 @@
           <w:bCs/>
           <w:color w:val="05192D"/>
           <w:kern w:val="0"/>
+          <w:highlight w:val="yellow"/>
           <w14:ligatures w14:val="none"/>
         </w:rPr>
         <w:t>international</w:t>
@@ -144,9 +157,19 @@
           <w:rFonts w:ascii="Arial" w:eastAsia="Times New Roman" w:hAnsi="Arial" w:cs="Arial"/>
           <w:color w:val="05192D"/>
           <w:kern w:val="0"/>
-          <w14:ligatures w14:val="none"/>
-        </w:rPr>
-        <w:t> students present in the study.</w:t>
+          <w:highlight w:val="yellow"/>
+          <w14:ligatures w14:val="none"/>
+        </w:rPr>
+        <w:t> students</w:t>
+      </w:r>
+      <w:r>
+        <w:rPr>
+          <w:rFonts w:ascii="Arial" w:eastAsia="Times New Roman" w:hAnsi="Arial" w:cs="Arial"/>
+          <w:color w:val="05192D"/>
+          <w:kern w:val="0"/>
+          <w14:ligatures w14:val="none"/>
+        </w:rPr>
+        <w:t xml:space="preserve"> present in the study.</w:t>
       </w:r>
     </w:p>
     <w:p>
@@ -602,6 +625,9 @@
         <w:jc w:val="center"/>
       </w:pPr>
       <w:r>
+        <w:rPr>
+          <w:noProof/>
+        </w:rPr>
         <w:drawing>
           <wp:inline distT="0" distB="0" distL="0" distR="0" wp14:anchorId="31944C1D" wp14:editId="0B401B90">
             <wp:extent cx="4565326" cy="2592871"/>
@@ -647,7 +673,16 @@
     </w:p>
     <w:p>
       <w:r>
-        <w:t>The study found that international students have a higher risk of mental health difficulties than the general population, and that social connectedness (belonging to a social group) and acculturative stress (stress associated with joining a new culture) are predictive of depression.</w:t>
+        <w:t xml:space="preserve">The study found that </w:t>
+      </w:r>
+      <w:r>
+        <w:rPr>
+          <w:highlight w:val="yellow"/>
+        </w:rPr>
+        <w:t>international students have a higher risk of mental health difficulties than the general population,</w:t>
+      </w:r>
+      <w:r>
+        <w:t xml:space="preserve"> and that social connectedness (belonging to a social group) and acculturative stress (stress associated with joining a new culture) are predictive of depression.</w:t>
       </w:r>
     </w:p>
     <w:p>
@@ -671,6 +706,9 @@
     <w:p/>
     <w:p>
       <w:r>
+        <w:rPr>
+          <w:noProof/>
+        </w:rPr>
         <w:drawing>
           <wp:inline distT="0" distB="0" distL="0" distR="0" wp14:anchorId="4466CD87" wp14:editId="5FE4DE59">
             <wp:extent cx="5943600" cy="2371090"/>
@@ -1602,6 +1640,7 @@
   <w:style w:type="character" w:default="1" w:styleId="DefaultParagraphFont">
     <w:name w:val="Default Paragraph Font"/>
     <w:uiPriority w:val="1"/>
+    <w:semiHidden/>
     <w:unhideWhenUsed/>
   </w:style>
   <w:style w:type="table" w:default="1" w:styleId="TableNormal">

</xml_diff>